<commit_message>
Mon Mar  9 06:08:53 PM CST 2026
</commit_message>
<xml_diff>
--- a/inst/extdata/complex.docx
+++ b/inst/extdata/complex.docx
@@ -6,15 +6,14 @@
       <w:pPr>
         <w:pStyle w:val="189"/>
       </w:pPr>
-      <w:bookmarkStart w:id="2" w:name="_GoBack"/>
-      <w:bookmarkEnd w:id="2"/>
-      <w:bookmarkStart w:id="0" w:name="refs"/>
-      <w:bookmarkStart w:id="1" w:name="ref-TISIDB_an_inte_Ru_Be_2019"/>
+      <w:bookmarkStart w:id="0" w:name="ref-TISIDB_an_inte_Ru_Be_2019"/>
+      <w:bookmarkStart w:id="1" w:name="refs"/>
     </w:p>
     <w:bookmarkEnd w:id="0"/>
     <w:bookmarkEnd w:id="1"/>
     <w:sectPr>
       <w:headerReference r:id="rId6" w:type="first"/>
+      <w:footerReference r:id="rId8" w:type="first"/>
       <w:headerReference r:id="rId5" w:type="default"/>
       <w:footerReference r:id="rId7" w:type="default"/>
       <w:type w:val="continuous"/>
@@ -60,13 +59,6 @@
       <w:snapToGrid w:val="0"/>
       <w:spacing w:before="0" w:beforeAutospacing="0" w:after="0" w:afterAutospacing="0" w:line="240" w:lineRule="auto"/>
       <w:jc w:val="left"/>
-      <w:rPr>
-        <w:rFonts w:hint="default" w:ascii="微软雅黑" w:hAnsi="微软雅黑" w:eastAsia="微软雅黑" w:cs="Times New Roman"/>
-        <w:kern w:val="2"/>
-        <w:sz w:val="16"/>
-        <w:szCs w:val="22"/>
-        <w:lang w:eastAsia="zh-CN"/>
-      </w:rPr>
     </w:pPr>
     <w:r>
       <w:rPr>
@@ -196,7 +188,7 @@
                               <w:szCs w:val="24"/>
                               <w:lang w:val="en-US" w:eastAsia="zh-CN" w:bidi="ar-SA"/>
                             </w:rPr>
-                            <w:t xml:space="preserve"> 页 共 7 页</w:t>
+                            <w:t xml:space="preserve"> 页 </w:t>
                           </w:r>
                         </w:p>
                       </w:txbxContent>
@@ -305,7 +297,7 @@
                         <w:szCs w:val="24"/>
                         <w:lang w:val="en-US" w:eastAsia="zh-CN" w:bidi="ar-SA"/>
                       </w:rPr>
-                      <w:t xml:space="preserve"> 页 共 7 页</w:t>
+                      <w:t xml:space="preserve"> 页 </w:t>
                     </w:r>
                   </w:p>
                 </w:txbxContent>
@@ -315,291 +307,18 @@
         </mc:Fallback>
       </mc:AlternateContent>
     </w:r>
-    <w:r>
-      <w:rPr>
-        <w:rFonts w:hint="eastAsia" w:ascii="微软雅黑" w:hAnsi="微软雅黑" w:eastAsia="微软雅黑" w:cs="Times New Roman"/>
-        <w:kern w:val="2"/>
-        <w:sz w:val="16"/>
-        <w:szCs w:val="22"/>
-        <w:lang w:eastAsia="zh-CN"/>
-      </w:rPr>
-      <w:t>杭州铂赛</w:t>
-    </w:r>
-    <w:r>
-      <w:rPr>
-        <w:rFonts w:hint="default" w:ascii="微软雅黑" w:hAnsi="微软雅黑" w:eastAsia="微软雅黑" w:cs="Times New Roman"/>
-        <w:kern w:val="2"/>
-        <w:sz w:val="16"/>
-        <w:szCs w:val="22"/>
-        <w:lang w:eastAsia="zh-CN"/>
-      </w:rPr>
-      <w:t xml:space="preserve">生物科技有限公司 </w:t>
-    </w:r>
-    <w:r>
-      <w:rPr>
-        <w:rFonts w:hint="eastAsia" w:ascii="微软雅黑" w:hAnsi="微软雅黑" w:eastAsia="微软雅黑" w:cs="Times New Roman"/>
-        <w:kern w:val="2"/>
-        <w:sz w:val="16"/>
-        <w:szCs w:val="22"/>
-        <w:lang w:eastAsia="zh-CN"/>
-      </w:rPr>
-      <w:t xml:space="preserve">                                                          </w:t>
-    </w:r>
-    <w:r>
-      <w:rPr>
-        <w:rFonts w:hint="eastAsia" w:ascii="微软雅黑" w:hAnsi="微软雅黑" w:eastAsia="微软雅黑" w:cs="Times New Roman"/>
-        <w:kern w:val="2"/>
-        <w:sz w:val="16"/>
-        <w:szCs w:val="22"/>
-        <w:lang w:val="en-US" w:eastAsia="zh-CN"/>
-      </w:rPr>
-      <w:tab/>
-    </w:r>
-    <w:r>
-      <w:rPr>
-        <w:rFonts w:hint="eastAsia" w:ascii="微软雅黑" w:hAnsi="微软雅黑" w:eastAsia="微软雅黑" w:cs="Times New Roman"/>
-        <w:kern w:val="2"/>
-        <w:sz w:val="16"/>
-        <w:szCs w:val="22"/>
-        <w:lang w:val="en-US" w:eastAsia="zh-CN"/>
-      </w:rPr>
-      <w:tab/>
-    </w:r>
-    <w:r>
-      <w:rPr>
-        <w:rFonts w:hint="eastAsia" w:ascii="微软雅黑" w:hAnsi="微软雅黑" w:eastAsia="微软雅黑" w:cs="Times New Roman"/>
-        <w:kern w:val="2"/>
-        <w:sz w:val="16"/>
-        <w:szCs w:val="22"/>
-        <w:lang w:val="en-US" w:eastAsia="zh-CN"/>
-      </w:rPr>
-      <w:tab/>
-    </w:r>
-    <w:r>
-      <w:rPr>
-        <w:rFonts w:hint="eastAsia" w:ascii="微软雅黑" w:hAnsi="微软雅黑" w:eastAsia="微软雅黑" w:cs="Times New Roman"/>
-        <w:kern w:val="2"/>
-        <w:sz w:val="16"/>
-        <w:szCs w:val="22"/>
-        <w:lang w:val="en-US" w:eastAsia="zh-CN"/>
-      </w:rPr>
-      <w:t xml:space="preserve">   </w:t>
-    </w:r>
-    <w:r>
-      <w:rPr>
-        <w:rFonts w:hint="eastAsia" w:ascii="微软雅黑" w:hAnsi="微软雅黑" w:eastAsia="微软雅黑" w:cs="Times New Roman"/>
-        <w:kern w:val="2"/>
-        <w:sz w:val="16"/>
-        <w:szCs w:val="22"/>
-        <w:lang w:eastAsia="zh-CN"/>
-      </w:rPr>
-      <w:t>电话：0571-82172675</w:t>
-    </w:r>
   </w:p>
+</w:ftr>
+</file>
+
+<file path=word/footer2.xml><?xml version="1.0" encoding="utf-8"?>
+<w:ftr xmlns:wpc="http://schemas.microsoft.com/office/word/2010/wordprocessingCanvas" xmlns:mc="http://schemas.openxmlformats.org/markup-compatibility/2006" xmlns:o="urn:schemas-microsoft-com:office:office" xmlns:r="http://schemas.openxmlformats.org/officeDocument/2006/relationships" xmlns:m="http://schemas.openxmlformats.org/officeDocument/2006/math" xmlns:v="urn:schemas-microsoft-com:vml" xmlns:wp14="http://schemas.microsoft.com/office/word/2010/wordprocessingDrawing" xmlns:wp="http://schemas.openxmlformats.org/drawingml/2006/wordprocessingDrawing" xmlns:w10="urn:schemas-microsoft-com:office:word" xmlns:w="http://schemas.openxmlformats.org/wordprocessingml/2006/main" xmlns:w14="http://schemas.microsoft.com/office/word/2010/wordml" xmlns:w15="http://schemas.microsoft.com/office/word/2012/wordml" xmlns:wpg="http://schemas.microsoft.com/office/word/2010/wordprocessingGroup" xmlns:wpi="http://schemas.microsoft.com/office/word/2010/wordprocessingInk" xmlns:wne="http://schemas.microsoft.com/office/word/2006/wordml" xmlns:wps="http://schemas.microsoft.com/office/word/2010/wordprocessingShape" xmlns:wpsCustomData="http://www.wps.cn/officeDocument/2013/wpsCustomData" mc:Ignorable="w14 w15 wp14">
   <w:p>
     <w:pPr>
-      <w:widowControl w:val="0"/>
-      <w:spacing w:before="0" w:beforeAutospacing="0" w:after="0" w:afterAutospacing="0" w:line="240" w:lineRule="auto"/>
-      <w:jc w:val="both"/>
-      <w:rPr>
-        <w:rFonts w:hint="default" w:ascii="微软雅黑" w:hAnsi="微软雅黑" w:eastAsia="微软雅黑" w:cs="Times New Roman"/>
-        <w:kern w:val="2"/>
-        <w:sz w:val="16"/>
-        <w:lang w:eastAsia="zh-CN"/>
-      </w:rPr>
-    </w:pPr>
-    <w:r>
-      <w:rPr>
-        <w:rFonts w:hint="eastAsia" w:ascii="微软雅黑" w:hAnsi="微软雅黑" w:eastAsia="微软雅黑" w:cs="Times New Roman"/>
-        <w:kern w:val="2"/>
-        <w:sz w:val="16"/>
-        <w:lang w:eastAsia="zh-CN"/>
-      </w:rPr>
-      <w:t xml:space="preserve">杭州市滨江区江南大道1088号 中南国际大厦1805                             </w:t>
-    </w:r>
-    <w:r>
-      <w:rPr>
-        <w:rFonts w:hint="eastAsia" w:ascii="微软雅黑" w:hAnsi="微软雅黑" w:eastAsia="微软雅黑" w:cs="Times New Roman"/>
-        <w:kern w:val="2"/>
-        <w:sz w:val="16"/>
-        <w:lang w:val="en-US" w:eastAsia="zh-CN"/>
-      </w:rPr>
-      <w:tab/>
-    </w:r>
-    <w:r>
-      <w:rPr>
-        <w:rFonts w:hint="eastAsia" w:ascii="微软雅黑" w:hAnsi="微软雅黑" w:eastAsia="微软雅黑" w:cs="Times New Roman"/>
-        <w:kern w:val="2"/>
-        <w:sz w:val="16"/>
-        <w:lang w:val="en-US" w:eastAsia="zh-CN"/>
-      </w:rPr>
-      <w:tab/>
-    </w:r>
-    <w:r>
-      <w:rPr>
-        <w:rFonts w:hint="eastAsia" w:ascii="微软雅黑" w:hAnsi="微软雅黑" w:eastAsia="微软雅黑" w:cs="Times New Roman"/>
-        <w:kern w:val="2"/>
-        <w:sz w:val="16"/>
-        <w:lang w:val="en-US" w:eastAsia="zh-CN"/>
-      </w:rPr>
-      <w:t xml:space="preserve">    </w:t>
-    </w:r>
-    <w:r>
-      <w:rPr>
-        <w:rFonts w:hint="eastAsia" w:ascii="微软雅黑" w:hAnsi="微软雅黑" w:eastAsia="微软雅黑" w:cs="Times New Roman"/>
-        <w:kern w:val="2"/>
-        <w:sz w:val="16"/>
-        <w:lang w:eastAsia="zh-CN"/>
-      </w:rPr>
-      <w:t>邮箱：service</w:t>
-    </w:r>
-    <w:r>
-      <w:rPr>
-        <w:rFonts w:hint="default" w:ascii="微软雅黑" w:hAnsi="微软雅黑" w:eastAsia="微软雅黑" w:cs="Times New Roman"/>
-        <w:kern w:val="2"/>
-        <w:sz w:val="16"/>
-        <w:lang w:eastAsia="zh-CN"/>
-      </w:rPr>
-      <w:t>@</w:t>
-    </w:r>
-    <w:r>
-      <w:rPr>
-        <w:rFonts w:hint="eastAsia" w:ascii="微软雅黑" w:hAnsi="微软雅黑" w:eastAsia="微软雅黑" w:cs="Times New Roman"/>
-        <w:kern w:val="2"/>
-        <w:sz w:val="16"/>
-        <w:lang w:eastAsia="zh-CN"/>
-      </w:rPr>
-      <w:t>bio-science</w:t>
-    </w:r>
-    <w:r>
-      <w:rPr>
-        <w:rFonts w:hint="default" w:ascii="微软雅黑" w:hAnsi="微软雅黑" w:eastAsia="微软雅黑" w:cs="Times New Roman"/>
-        <w:kern w:val="2"/>
-        <w:sz w:val="16"/>
-        <w:lang w:eastAsia="zh-CN"/>
-      </w:rPr>
-      <w:t>.</w:t>
-    </w:r>
-    <w:r>
-      <w:rPr>
-        <w:rFonts w:hint="eastAsia" w:ascii="微软雅黑" w:hAnsi="微软雅黑" w:eastAsia="微软雅黑" w:cs="Times New Roman"/>
-        <w:kern w:val="2"/>
-        <w:sz w:val="16"/>
-        <w:lang w:eastAsia="zh-CN"/>
-      </w:rPr>
-      <w:t>top</w:t>
-    </w:r>
-  </w:p>
-  <w:p>
-    <w:pPr>
-      <w:widowControl w:val="0"/>
-      <w:tabs>
-        <w:tab w:val="center" w:pos="4153"/>
-        <w:tab w:val="right" w:pos="8306"/>
-      </w:tabs>
-      <w:snapToGrid w:val="0"/>
-      <w:spacing w:before="0" w:beforeAutospacing="0" w:after="0" w:afterAutospacing="0" w:line="240" w:lineRule="auto"/>
-      <w:jc w:val="left"/>
-      <w:rPr>
-        <w:rFonts w:hint="default" w:eastAsia="宋体" w:cs="Times New Roman"/>
-        <w:kern w:val="2"/>
-        <w:sz w:val="18"/>
-        <w:lang w:eastAsia="zh-CN"/>
-      </w:rPr>
-    </w:pPr>
-    <w:r>
-      <w:rPr>
-        <w:rFonts w:hint="eastAsia" w:ascii="微软雅黑" w:hAnsi="微软雅黑" w:eastAsia="微软雅黑" w:cs="Times New Roman"/>
-        <w:kern w:val="2"/>
-        <w:sz w:val="16"/>
-        <w:szCs w:val="22"/>
-        <w:lang w:eastAsia="zh-CN"/>
-      </w:rPr>
-      <w:t xml:space="preserve">邮编：310000                                                                  </w:t>
-    </w:r>
-    <w:r>
-      <w:rPr>
-        <w:rFonts w:hint="eastAsia" w:ascii="微软雅黑" w:hAnsi="微软雅黑" w:eastAsia="微软雅黑" w:cs="Times New Roman"/>
-        <w:kern w:val="2"/>
-        <w:sz w:val="16"/>
-        <w:szCs w:val="22"/>
-        <w:lang w:val="en-US" w:eastAsia="zh-CN"/>
-      </w:rPr>
-      <w:tab/>
-    </w:r>
-    <w:r>
-      <w:rPr>
-        <w:rFonts w:hint="eastAsia" w:ascii="微软雅黑" w:hAnsi="微软雅黑" w:eastAsia="微软雅黑" w:cs="Times New Roman"/>
-        <w:kern w:val="2"/>
-        <w:sz w:val="16"/>
-        <w:szCs w:val="22"/>
-        <w:lang w:eastAsia="zh-CN"/>
-      </w:rPr>
-      <w:t>网址：</w:t>
-    </w:r>
-    <w:r>
-      <w:rPr>
-        <w:rFonts w:hint="default" w:ascii="微软雅黑" w:hAnsi="微软雅黑" w:eastAsia="微软雅黑" w:cs="Times New Roman"/>
-        <w:kern w:val="2"/>
-        <w:sz w:val="16"/>
-        <w:szCs w:val="22"/>
-        <w:lang w:eastAsia="zh-CN"/>
-      </w:rPr>
-      <w:t>www.</w:t>
-    </w:r>
-    <w:r>
-      <w:rPr>
-        <w:rFonts w:hint="eastAsia" w:ascii="微软雅黑" w:hAnsi="微软雅黑" w:eastAsia="微软雅黑" w:cs="Times New Roman"/>
-        <w:kern w:val="2"/>
-        <w:sz w:val="16"/>
-        <w:szCs w:val="22"/>
-        <w:lang w:eastAsia="zh-CN"/>
-      </w:rPr>
-      <w:t>Bio-science</w:t>
-    </w:r>
-    <w:r>
-      <w:rPr>
-        <w:rFonts w:hint="default" w:ascii="微软雅黑" w:hAnsi="微软雅黑" w:eastAsia="微软雅黑" w:cs="Times New Roman"/>
-        <w:kern w:val="2"/>
-        <w:sz w:val="16"/>
-        <w:szCs w:val="22"/>
-        <w:lang w:eastAsia="zh-CN"/>
-      </w:rPr>
-      <w:t>.</w:t>
-    </w:r>
-    <w:r>
-      <w:rPr>
-        <w:rFonts w:hint="eastAsia" w:ascii="微软雅黑" w:hAnsi="微软雅黑" w:eastAsia="微软雅黑" w:cs="Times New Roman"/>
-        <w:kern w:val="2"/>
-        <w:sz w:val="16"/>
-        <w:szCs w:val="22"/>
-        <w:lang w:eastAsia="zh-CN"/>
-      </w:rPr>
-      <w:t>top</w:t>
-    </w:r>
-  </w:p>
-  <w:p>
-    <w:pPr>
-      <w:widowControl w:val="0"/>
-      <w:tabs>
-        <w:tab w:val="center" w:pos="4153"/>
-        <w:tab w:val="right" w:pos="8306"/>
-      </w:tabs>
-      <w:snapToGrid w:val="0"/>
-      <w:spacing w:before="0" w:beforeAutospacing="0" w:after="0" w:afterAutospacing="0" w:line="240" w:lineRule="auto"/>
-      <w:jc w:val="left"/>
-      <w:rPr>
-        <w:rFonts w:hint="default" w:eastAsia="宋体" w:cs="Times New Roman"/>
-        <w:kern w:val="2"/>
-        <w:sz w:val="18"/>
-        <w:lang w:eastAsia="zh-CN"/>
-      </w:rPr>
-    </w:pPr>
-  </w:p>
-  <w:p>
-    <w:pPr>
       <w:pStyle w:val="20"/>
     </w:pPr>
+    <w:bookmarkStart w:id="2" w:name="_GoBack"/>
+    <w:bookmarkEnd w:id="2"/>
   </w:p>
 </w:ftr>
 </file>
@@ -638,17 +357,40 @@
       </w:pBdr>
       <w:jc w:val="both"/>
     </w:pPr>
+  </w:p>
+</w:hdr>
+</file>
+
+<file path=word/header2.xml><?xml version="1.0" encoding="utf-8"?>
+<w:hdr xmlns:wpc="http://schemas.microsoft.com/office/word/2010/wordprocessingCanvas" xmlns:mc="http://schemas.openxmlformats.org/markup-compatibility/2006" xmlns:o="urn:schemas-microsoft-com:office:office" xmlns:r="http://schemas.openxmlformats.org/officeDocument/2006/relationships" xmlns:m="http://schemas.openxmlformats.org/officeDocument/2006/math" xmlns:v="urn:schemas-microsoft-com:vml" xmlns:wp14="http://schemas.microsoft.com/office/word/2010/wordprocessingDrawing" xmlns:wp="http://schemas.openxmlformats.org/drawingml/2006/wordprocessingDrawing" xmlns:w10="urn:schemas-microsoft-com:office:word" xmlns:w="http://schemas.openxmlformats.org/wordprocessingml/2006/main" xmlns:w14="http://schemas.microsoft.com/office/word/2010/wordml" xmlns:w15="http://schemas.microsoft.com/office/word/2012/wordml" xmlns:wpg="http://schemas.microsoft.com/office/word/2010/wordprocessingGroup" xmlns:wpi="http://schemas.microsoft.com/office/word/2010/wordprocessingInk" xmlns:wne="http://schemas.microsoft.com/office/word/2006/wordml" xmlns:wps="http://schemas.microsoft.com/office/word/2010/wordprocessingShape" xmlns:wpsCustomData="http://www.wps.cn/officeDocument/2013/wpsCustomData" mc:Ignorable="w14 w15 wp14">
+  <w:p>
+    <w:pPr>
+      <w:pBdr>
+        <w:bottom w:val="none" w:color="auto" w:sz="0" w:space="0"/>
+      </w:pBdr>
+      <w:jc w:val="both"/>
+    </w:pPr>
     <w:r>
       <w:rPr>
-        <w:rFonts w:hint="eastAsia" w:hAnsi="华文行楷" w:eastAsia="华文行楷" w:cs="华文行楷"/>
-        <w:szCs w:val="21"/>
-        <w:u w:val="single"/>
+        <w:rFonts w:eastAsia="Microsoft YaHei"/>
+        <w:b/>
+        <w:bCs/>
+        <w:sz w:val="52"/>
+        <w:szCs w:val="52"/>
       </w:rPr>
       <w:drawing>
-        <wp:inline distT="0" distB="0" distL="114300" distR="114300">
-          <wp:extent cx="1149350" cy="431165"/>
-          <wp:effectExtent l="0" t="0" r="12700" b="6985"/>
-          <wp:docPr id="10" name="图片 19" descr="汇医助研--最终使用"/>
+        <wp:anchor distT="0" distB="0" distL="114300" distR="114300" simplePos="0" relativeHeight="251660288" behindDoc="1" locked="0" layoutInCell="1" allowOverlap="1">
+          <wp:simplePos x="0" y="0"/>
+          <wp:positionH relativeFrom="column">
+            <wp:posOffset>-1139190</wp:posOffset>
+          </wp:positionH>
+          <wp:positionV relativeFrom="paragraph">
+            <wp:posOffset>-1236980</wp:posOffset>
+          </wp:positionV>
+          <wp:extent cx="7462520" cy="11163300"/>
+          <wp:effectExtent l="0" t="0" r="5080" b="0"/>
+          <wp:wrapNone/>
+          <wp:docPr id="2" name="图片 4" descr="/home/echo/Pictures/bioinformatic_cover.pngbioinformatic_cover"/>
           <wp:cNvGraphicFramePr>
             <a:graphicFrameLocks xmlns:a="http://schemas.openxmlformats.org/drawingml/2006/main" noChangeAspect="1"/>
           </wp:cNvGraphicFramePr>
@@ -656,13 +398,14 @@
             <a:graphicData uri="http://schemas.openxmlformats.org/drawingml/2006/picture">
               <pic:pic xmlns:pic="http://schemas.openxmlformats.org/drawingml/2006/picture">
                 <pic:nvPicPr>
-                  <pic:cNvPr id="10" name="图片 19" descr="汇医助研--最终使用"/>
+                  <pic:cNvPr id="2" name="图片 4" descr="/home/echo/Pictures/bioinformatic_cover.pngbioinformatic_cover"/>
                   <pic:cNvPicPr>
                     <a:picLocks noChangeAspect="1"/>
                   </pic:cNvPicPr>
                 </pic:nvPicPr>
                 <pic:blipFill>
                   <a:blip r:embed="rId1"/>
+                  <a:srcRect l="2827" t="587" r="-177" b="20032"/>
                   <a:stretch>
                     <a:fillRect/>
                   </a:stretch>
@@ -670,7 +413,7 @@
                 <pic:spPr>
                   <a:xfrm>
                     <a:off x="0" y="0"/>
-                    <a:ext cx="1149350" cy="431165"/>
+                    <a:ext cx="7462520" cy="11163300"/>
                   </a:xfrm>
                   <a:prstGeom prst="rect">
                     <a:avLst/>
@@ -683,143 +426,8 @@
               </pic:pic>
             </a:graphicData>
           </a:graphic>
-        </wp:inline>
+        </wp:anchor>
       </w:drawing>
-    </w:r>
-    <w:r>
-      <w:rPr>
-        <w:rFonts w:hint="eastAsia" w:hAnsi="华文行楷" w:eastAsia="华文行楷" w:cs="华文行楷"/>
-        <w:szCs w:val="21"/>
-        <w:u w:val="single"/>
-      </w:rPr>
-      <w:t xml:space="preserve">                 </w:t>
-    </w:r>
-    <w:r>
-      <w:rPr>
-        <w:rFonts w:hint="eastAsia" w:hAnsi="华文行楷" w:eastAsia="华文行楷" w:cs="华文行楷"/>
-        <w:szCs w:val="21"/>
-        <w:u w:val="single"/>
-        <w:lang w:val="en-US" w:eastAsia="zh-CN"/>
-      </w:rPr>
-      <w:t xml:space="preserve">                       </w:t>
-    </w:r>
-    <w:r>
-      <w:rPr>
-        <w:rFonts w:hint="eastAsia" w:hAnsi="华文行楷" w:eastAsia="华文行楷" w:cs="华文行楷"/>
-        <w:szCs w:val="21"/>
-        <w:u w:val="single"/>
-      </w:rPr>
-      <w:t xml:space="preserve">      </w:t>
-    </w:r>
-    <w:r>
-      <w:rPr>
-        <w:rFonts w:hint="eastAsia" w:ascii="宋体" w:hAnsi="宋体" w:cs="宋体"/>
-        <w:b/>
-        <w:bCs/>
-        <w:color w:val="2B68AD"/>
-        <w:sz w:val="20"/>
-        <w:szCs w:val="21"/>
-        <w:u w:val="single"/>
-      </w:rPr>
-      <w:t>厦门大学药学院邗江区生物医药成果转化中心</w:t>
-    </w:r>
-  </w:p>
-</w:hdr>
-</file>
-
-<file path=word/header2.xml><?xml version="1.0" encoding="utf-8"?>
-<w:hdr xmlns:wpc="http://schemas.microsoft.com/office/word/2010/wordprocessingCanvas" xmlns:mc="http://schemas.openxmlformats.org/markup-compatibility/2006" xmlns:o="urn:schemas-microsoft-com:office:office" xmlns:r="http://schemas.openxmlformats.org/officeDocument/2006/relationships" xmlns:m="http://schemas.openxmlformats.org/officeDocument/2006/math" xmlns:v="urn:schemas-microsoft-com:vml" xmlns:wp14="http://schemas.microsoft.com/office/word/2010/wordprocessingDrawing" xmlns:wp="http://schemas.openxmlformats.org/drawingml/2006/wordprocessingDrawing" xmlns:w10="urn:schemas-microsoft-com:office:word" xmlns:w="http://schemas.openxmlformats.org/wordprocessingml/2006/main" xmlns:w14="http://schemas.microsoft.com/office/word/2010/wordml" xmlns:w15="http://schemas.microsoft.com/office/word/2012/wordml" xmlns:wpg="http://schemas.microsoft.com/office/word/2010/wordprocessingGroup" xmlns:wpi="http://schemas.microsoft.com/office/word/2010/wordprocessingInk" xmlns:wne="http://schemas.microsoft.com/office/word/2006/wordml" xmlns:wps="http://schemas.microsoft.com/office/word/2010/wordprocessingShape" xmlns:wpsCustomData="http://www.wps.cn/officeDocument/2013/wpsCustomData" mc:Ignorable="w14 w15 wp14">
-  <w:p>
-    <w:pPr>
-      <w:pBdr>
-        <w:bottom w:val="none" w:color="auto" w:sz="0" w:space="0"/>
-      </w:pBdr>
-      <w:jc w:val="both"/>
-    </w:pPr>
-    <w:r>
-      <w:rPr>
-        <w:rFonts w:hint="eastAsia" w:hAnsi="华文行楷" w:eastAsia="华文行楷" w:cs="华文行楷"/>
-        <w:szCs w:val="21"/>
-        <w:u w:val="single"/>
-      </w:rPr>
-      <w:drawing>
-        <wp:inline distT="0" distB="0" distL="114300" distR="114300">
-          <wp:extent cx="1149350" cy="431165"/>
-          <wp:effectExtent l="0" t="0" r="12700" b="6985"/>
-          <wp:docPr id="3" name="图片 19" descr="汇医助研--最终使用"/>
-          <wp:cNvGraphicFramePr>
-            <a:graphicFrameLocks xmlns:a="http://schemas.openxmlformats.org/drawingml/2006/main" noChangeAspect="1"/>
-          </wp:cNvGraphicFramePr>
-          <a:graphic xmlns:a="http://schemas.openxmlformats.org/drawingml/2006/main">
-            <a:graphicData uri="http://schemas.openxmlformats.org/drawingml/2006/picture">
-              <pic:pic xmlns:pic="http://schemas.openxmlformats.org/drawingml/2006/picture">
-                <pic:nvPicPr>
-                  <pic:cNvPr id="3" name="图片 19" descr="汇医助研--最终使用"/>
-                  <pic:cNvPicPr>
-                    <a:picLocks noChangeAspect="1"/>
-                  </pic:cNvPicPr>
-                </pic:nvPicPr>
-                <pic:blipFill>
-                  <a:blip r:embed="rId1"/>
-                  <a:stretch>
-                    <a:fillRect/>
-                  </a:stretch>
-                </pic:blipFill>
-                <pic:spPr>
-                  <a:xfrm>
-                    <a:off x="0" y="0"/>
-                    <a:ext cx="1149350" cy="431165"/>
-                  </a:xfrm>
-                  <a:prstGeom prst="rect">
-                    <a:avLst/>
-                  </a:prstGeom>
-                  <a:noFill/>
-                  <a:ln>
-                    <a:noFill/>
-                  </a:ln>
-                </pic:spPr>
-              </pic:pic>
-            </a:graphicData>
-          </a:graphic>
-        </wp:inline>
-      </w:drawing>
-    </w:r>
-    <w:r>
-      <w:rPr>
-        <w:rFonts w:hint="eastAsia" w:hAnsi="华文行楷" w:eastAsia="华文行楷" w:cs="华文行楷"/>
-        <w:szCs w:val="21"/>
-        <w:u w:val="single"/>
-      </w:rPr>
-      <w:t xml:space="preserve">                 </w:t>
-    </w:r>
-    <w:r>
-      <w:rPr>
-        <w:rFonts w:hint="eastAsia" w:hAnsi="华文行楷" w:eastAsia="华文行楷" w:cs="华文行楷"/>
-        <w:szCs w:val="21"/>
-        <w:u w:val="single"/>
-        <w:lang w:val="en-US" w:eastAsia="zh-CN"/>
-      </w:rPr>
-      <w:t xml:space="preserve">                       </w:t>
-    </w:r>
-    <w:r>
-      <w:rPr>
-        <w:rFonts w:hint="eastAsia" w:hAnsi="华文行楷" w:eastAsia="华文行楷" w:cs="华文行楷"/>
-        <w:szCs w:val="21"/>
-        <w:u w:val="single"/>
-      </w:rPr>
-      <w:t xml:space="preserve">      </w:t>
-    </w:r>
-    <w:r>
-      <w:rPr>
-        <w:rFonts w:hint="eastAsia" w:ascii="宋体" w:hAnsi="宋体" w:cs="宋体"/>
-        <w:b/>
-        <w:bCs/>
-        <w:color w:val="2B68AD"/>
-        <w:sz w:val="20"/>
-        <w:szCs w:val="21"/>
-        <w:u w:val="single"/>
-      </w:rPr>
-      <w:t>厦门大学药学院邗江区生物医药成果转化中心</w:t>
     </w:r>
   </w:p>
   <w:p>

</xml_diff>

<commit_message>
Tue Mar 24 12:40:31 AM CST 2026
</commit_message>
<xml_diff>
--- a/inst/extdata/complex.docx
+++ b/inst/extdata/complex.docx
@@ -159,11 +159,6 @@
       </w:r>
     </w:p>
     <w:p>
-      <w:r>
-        <w:br w:type="page"/>
-      </w:r>
-    </w:p>
-    <w:p>
       <w:pPr>
         <w:pStyle w:val="2"/>
         <w:bidi w:val="0"/>
@@ -171,19 +166,43 @@
           <w:rFonts w:hint="default"/>
           <w:lang w:val="en-US"/>
         </w:rPr>
+        <w:sectPr>
+          <w:headerReference r:id="rId5" w:type="default"/>
+          <w:pgSz w:w="11906" w:h="16838"/>
+          <w:pgMar w:top="1440" w:right="1800" w:bottom="1440" w:left="1800" w:header="851" w:footer="992" w:gutter="0"/>
+          <w:pgBorders>
+            <w:top w:val="none" w:sz="0" w:space="0"/>
+            <w:left w:val="none" w:sz="0" w:space="0"/>
+            <w:bottom w:val="none" w:sz="0" w:space="0"/>
+            <w:right w:val="none" w:sz="0" w:space="0"/>
+          </w:pgBorders>
+          <w:pgNumType w:fmt="decimalFullWidth" w:start="1"/>
+          <w:cols w:space="425" w:num="1"/>
+          <w:docGrid w:type="lines" w:linePitch="312" w:charSpace="0"/>
+        </w:sectPr>
       </w:pPr>
       <w:bookmarkStart w:id="0" w:name="进展"/>
-      <w:r>
-        <w:rPr>
-          <w:rFonts w:hint="eastAsia"/>
-        </w:rPr>
-        <w:t>进展</w:t>
-      </w:r>
-      <w:r>
+    </w:p>
+    <w:p>
+      <w:pPr>
+        <w:pStyle w:val="2"/>
+        <w:bidi w:val="0"/>
         <w:rPr>
           <w:rFonts w:hint="default"/>
           <w:lang w:val="en-US"/>
         </w:rPr>
+      </w:pPr>
+      <w:r>
+        <w:rPr>
+          <w:rFonts w:hint="eastAsia"/>
+        </w:rPr>
+        <w:t>进展</w:t>
+      </w:r>
+      <w:r>
+        <w:rPr>
+          <w:rFonts w:hint="default"/>
+          <w:lang w:val="en-US"/>
+        </w:rPr>
         <w:t xml:space="preserve"> </w:t>
       </w:r>
     </w:p>
@@ -373,94 +392,523 @@
         <w:rPr>
           <w:rFonts w:hint="eastAsia"/>
         </w:rPr>
-        <w:t>验证后有预</w:t>
+        <w:t>验证后有预测价值。(</w:t>
+      </w:r>
+      <w:r>
+        <w:t xml:space="preserve"> Fig. </w:t>
+      </w:r>
+      <w:r>
+        <w:fldChar w:fldCharType="begin"/>
+      </w:r>
+      <w:r>
+        <w:instrText xml:space="preserve"> HYPERLINK \l "IUA-ROC-evaluation-of-diagnostic-indicators" \h </w:instrText>
+      </w:r>
+      <w:r>
+        <w:fldChar w:fldCharType="separate"/>
+      </w:r>
+      <w:r>
+        <w:fldChar w:fldCharType="begin"/>
+      </w:r>
+      <w:r>
+        <w:instrText xml:space="preserve"> REF IUA-ROC-evaluation-of-diagnostic-indicators \h</w:instrText>
+      </w:r>
+      <w:r>
+        <w:fldChar w:fldCharType="separate"/>
+      </w:r>
+      <w:r>
+        <w:rPr>
+          <w:b/>
+          <w:strike w:val="0"/>
+        </w:rPr>
+        <w:t>4</w:t>
+      </w:r>
+      <w:r>
+        <w:fldChar w:fldCharType="end"/>
+      </w:r>
+      <w:r>
+        <w:fldChar w:fldCharType="end"/>
+      </w:r>
+      <w:r>
+        <w:t xml:space="preserve"> )</w:t>
+      </w:r>
+    </w:p>
+    <w:p>
+      <w:r>
+        <w:rPr>
+          <w:rFonts w:hint="eastAsia"/>
+        </w:rPr>
+        <w:t>到单细胞分析环节，细胞注释等也无问题。见</w:t>
+      </w:r>
+      <w:r>
+        <w:t xml:space="preserve"> Fig. </w:t>
+      </w:r>
+      <w:r>
+        <w:fldChar w:fldCharType="begin"/>
+      </w:r>
+      <w:r>
+        <w:instrText xml:space="preserve"> HYPERLINK \l "GSE215968-SCSA-Cell-type-annotation" \h </w:instrText>
+      </w:r>
+      <w:r>
+        <w:fldChar w:fldCharType="separate"/>
+      </w:r>
+      <w:r>
+        <w:fldChar w:fldCharType="begin"/>
+      </w:r>
+      <w:r>
+        <w:instrText xml:space="preserve"> REF GSE215968-SCSA-Cell-type-annotation \h</w:instrText>
+      </w:r>
+      <w:r>
+        <w:fldChar w:fldCharType="separate"/>
+      </w:r>
+      <w:r>
+        <w:rPr>
+          <w:b/>
+          <w:strike w:val="0"/>
+        </w:rPr>
+        <w:t>5</w:t>
+      </w:r>
+      <w:r>
+        <w:fldChar w:fldCharType="end"/>
+      </w:r>
+      <w:r>
+        <w:fldChar w:fldCharType="end"/>
+      </w:r>
+      <w:r>
+        <w:t xml:space="preserve"> </w:t>
+      </w:r>
+      <w:r>
+        <w:rPr>
+          <w:rFonts w:hint="eastAsia"/>
+        </w:rPr>
+        <w:t>，</w:t>
+      </w:r>
+      <w:r>
+        <w:t xml:space="preserve"> Fig. </w:t>
+      </w:r>
+      <w:r>
+        <w:fldChar w:fldCharType="begin"/>
+      </w:r>
+      <w:r>
+        <w:instrText xml:space="preserve"> HYPERLINK \l "GSE215968-Marker-Validation" \h </w:instrText>
+      </w:r>
+      <w:r>
+        <w:fldChar w:fldCharType="separate"/>
+      </w:r>
+      <w:r>
+        <w:fldChar w:fldCharType="begin"/>
+      </w:r>
+      <w:r>
+        <w:instrText xml:space="preserve"> REF GSE215968-Marker-Validation \h</w:instrText>
+      </w:r>
+      <w:r>
+        <w:fldChar w:fldCharType="separate"/>
+      </w:r>
+      <w:r>
+        <w:rPr>
+          <w:b/>
+          <w:strike w:val="0"/>
+        </w:rPr>
+        <w:t>6</w:t>
+      </w:r>
+      <w:r>
+        <w:fldChar w:fldCharType="end"/>
+      </w:r>
+      <w:r>
+        <w:fldChar w:fldCharType="end"/>
+      </w:r>
+    </w:p>
+    <w:bookmarkEnd w:id="0"/>
+    <w:p>
+      <w:pPr>
+        <w:pStyle w:val="4"/>
+        <w:bidi w:val="0"/>
+      </w:pPr>
+      <w:bookmarkStart w:id="1" w:name="问题"/>
+      <w:r>
+        <w:rPr>
+          <w:rFonts w:hint="eastAsia"/>
+        </w:rPr>
+        <w:t>问题</w:t>
+      </w:r>
+    </w:p>
+    <w:p>
+      <w:r>
+        <w:rPr>
+          <w:rFonts w:hint="eastAsia"/>
+        </w:rPr>
+        <w:t>到了筛选关键细胞环节，</w:t>
+      </w:r>
+      <w:r>
+        <w:t xml:space="preserve"> Fig. </w:t>
+      </w:r>
+      <w:r>
+        <w:fldChar w:fldCharType="begin"/>
+      </w:r>
+      <w:r>
+        <w:instrText xml:space="preserve"> HYPERLINK \l "GSE215968-SCSA-annotation-Cell-Proportions-in-each-sample" \h </w:instrText>
+      </w:r>
+      <w:r>
+        <w:fldChar w:fldCharType="separate"/>
+      </w:r>
+      <w:r>
+        <w:fldChar w:fldCharType="begin"/>
+      </w:r>
+      <w:r>
+        <w:instrText xml:space="preserve"> REF GSE215968-SCSA-annotation-Cell-Proportions-in-each-sample \h</w:instrText>
+      </w:r>
+      <w:r>
+        <w:fldChar w:fldCharType="separate"/>
+      </w:r>
+      <w:r>
+        <w:rPr>
+          <w:b/>
+          <w:strike w:val="0"/>
+        </w:rPr>
+        <w:t>7</w:t>
+      </w:r>
+      <w:r>
+        <w:fldChar w:fldCharType="end"/>
+      </w:r>
+      <w:r>
+        <w:fldChar w:fldCharType="end"/>
+      </w:r>
+      <w:r>
+        <w:t xml:space="preserve"> </w:t>
+      </w:r>
+      <w:r>
+        <w:rPr>
+          <w:rFonts w:hint="eastAsia"/>
+        </w:rPr>
+        <w:t>，</w:t>
+      </w:r>
+      <w:r>
+        <w:t xml:space="preserve"> </w:t>
+      </w:r>
+      <w:r>
+        <w:rPr>
+          <w:rFonts w:hint="eastAsia"/>
+        </w:rPr>
+        <w:t>有显著差异的细胞</w:t>
+      </w:r>
+      <w:r>
+        <w:t xml:space="preserve"> (Fig. </w:t>
+      </w:r>
+      <w:r>
+        <w:fldChar w:fldCharType="begin"/>
+      </w:r>
+      <w:r>
+        <w:instrText xml:space="preserve"> HYPERLINK \l "GSE215968-Cell-Proportion-intergroup-comparison" \h </w:instrText>
+      </w:r>
+      <w:r>
+        <w:fldChar w:fldCharType="separate"/>
+      </w:r>
+      <w:r>
+        <w:fldChar w:fldCharType="begin"/>
+      </w:r>
+      <w:r>
+        <w:instrText xml:space="preserve"> REF GSE215968-Cell-Proportion-intergroup-comparison \h</w:instrText>
+      </w:r>
+      <w:r>
+        <w:fldChar w:fldCharType="separate"/>
+      </w:r>
+      <w:r>
+        <w:rPr>
+          <w:b/>
+          <w:strike w:val="0"/>
+        </w:rPr>
+        <w:t>8</w:t>
+      </w:r>
+      <w:r>
+        <w:fldChar w:fldCharType="end"/>
+      </w:r>
+      <w:r>
+        <w:fldChar w:fldCharType="end"/>
+      </w:r>
+      <w:r>
+        <w:t xml:space="preserve"> ) </w:t>
+      </w:r>
+      <w:r>
+        <w:rPr>
+          <w:rFonts w:hint="eastAsia"/>
+        </w:rPr>
+        <w:t>为</w:t>
+      </w:r>
+      <w:r>
+        <w:t xml:space="preserve"> Cytotoxic NK </w:t>
+      </w:r>
+      <w:r>
+        <w:rPr>
+          <w:rFonts w:hint="eastAsia"/>
+        </w:rPr>
+        <w:t>和</w:t>
+      </w:r>
+      <w:r>
+        <w:t xml:space="preserve"> CD8+ T </w:t>
+      </w:r>
+      <w:r>
+        <w:rPr>
+          <w:rFonts w:hint="eastAsia"/>
+        </w:rPr>
+        <w:t>细胞。</w:t>
+      </w:r>
+      <w:r>
+        <w:t xml:space="preserve"> </w:t>
+      </w:r>
+      <w:r>
+        <w:rPr>
+          <w:rFonts w:hint="eastAsia"/>
+        </w:rPr>
+        <w:t>但两类细胞的两个生物标识物在组间不存在显著差异。</w:t>
+      </w:r>
+    </w:p>
+    <w:p>
+      <w:r>
+        <w:rPr>
+          <w:rFonts w:hint="eastAsia"/>
+        </w:rPr>
+        <w:t>基因</w:t>
+      </w:r>
+      <w:r>
+        <w:t xml:space="preserve"> H1-4 (HIST1H1E) </w:t>
+      </w:r>
+      <w:r>
+        <w:rPr>
+          <w:rFonts w:hint="eastAsia"/>
+        </w:rPr>
+        <w:t>在</w:t>
+      </w:r>
+      <w:r>
+        <w:t xml:space="preserve"> AS Epithelium </w:t>
+      </w:r>
+      <w:r>
+        <w:rPr>
+          <w:rFonts w:hint="eastAsia"/>
+        </w:rPr>
+        <w:t>和</w:t>
+      </w:r>
+      <w:r>
+        <w:t xml:space="preserve"> B </w:t>
+      </w:r>
+      <w:r>
+        <w:rPr>
+          <w:rFonts w:hint="eastAsia"/>
+        </w:rPr>
+        <w:t>细胞中有显著差异</w:t>
+      </w:r>
+      <w:r>
+        <w:t xml:space="preserve"> ( Fig. </w:t>
+      </w:r>
+      <w:r>
+        <w:fldChar w:fldCharType="begin"/>
+      </w:r>
+      <w:r>
+        <w:instrText xml:space="preserve"> HYPERLINK \l "GSE215968-wilcox-test-of-HIST1H1E-in-Cells" \h </w:instrText>
+      </w:r>
+      <w:r>
+        <w:fldChar w:fldCharType="separate"/>
+      </w:r>
+      <w:r>
+        <w:fldChar w:fldCharType="begin"/>
+      </w:r>
+      <w:r>
+        <w:instrText xml:space="preserve"> REF GSE215968-wilcox-test-of-HIST1H1E-in-Cells \h</w:instrText>
+      </w:r>
+      <w:r>
+        <w:fldChar w:fldCharType="separate"/>
+      </w:r>
+      <w:r>
+        <w:rPr>
+          <w:b/>
+          <w:strike w:val="0"/>
+        </w:rPr>
+        <w:t>10</w:t>
+      </w:r>
+      <w:r>
+        <w:fldChar w:fldCharType="end"/>
+      </w:r>
+      <w:r>
+        <w:fldChar w:fldCharType="end"/>
+      </w:r>
+      <w:r>
+        <w:t xml:space="preserve"> ) 。</w:t>
+      </w:r>
+    </w:p>
+    <w:p>
+      <w:r>
+        <w:rPr>
+          <w:rFonts w:hint="eastAsia"/>
+        </w:rPr>
+        <w:t>拟以</w:t>
+      </w:r>
+      <w:r>
+        <w:t xml:space="preserve"> B </w:t>
+      </w:r>
+      <w:r>
+        <w:rPr>
+          <w:rFonts w:hint="eastAsia"/>
+        </w:rPr>
+        <w:t>细胞为关键细胞，但效果较差，不符和方案预期。</w:t>
+      </w:r>
+      <w:r>
+        <w:t xml:space="preserve"> </w:t>
+      </w:r>
+      <w:r>
+        <w:rPr>
+          <w:rFonts w:hint="eastAsia"/>
+        </w:rPr>
+        <w:t>预期为：“子宫内膜上皮细胞、子宫内膜基质成纤维细胞、M2</w:t>
+      </w:r>
+      <w:r>
+        <w:t xml:space="preserve"> </w:t>
+      </w:r>
+      <w:r>
+        <w:rPr>
+          <w:rFonts w:hint="eastAsia"/>
+        </w:rPr>
+        <w:t>型巨噬细胞、活化型</w:t>
+      </w:r>
+      <w:r>
+        <w:t xml:space="preserve"> CD4+ T </w:t>
+      </w:r>
+      <w:r>
+        <w:rPr>
+          <w:rFonts w:hint="eastAsia"/>
+        </w:rPr>
+        <w:t>细胞、血管内皮细胞”</w:t>
+      </w:r>
+    </w:p>
+    <w:p>
+      <w:r>
+        <w:t xml:space="preserve">(FXYD7 </w:t>
+      </w:r>
+      <w:r>
+        <w:rPr>
+          <w:rFonts w:hint="eastAsia"/>
+        </w:rPr>
+        <w:t>在各细胞中的情况为</w:t>
+      </w:r>
+      <w:r>
+        <w:t xml:space="preserve"> Fig. </w:t>
+      </w:r>
+      <w:r>
+        <w:fldChar w:fldCharType="begin"/>
+      </w:r>
+      <w:r>
+        <w:instrText xml:space="preserve"> HYPERLINK \l "GSE215968-wilcox-test-of-FXYD7-in-Cells" \h </w:instrText>
+      </w:r>
+      <w:r>
+        <w:fldChar w:fldCharType="separate"/>
+      </w:r>
+      <w:r>
+        <w:fldChar w:fldCharType="begin"/>
+      </w:r>
+      <w:r>
+        <w:instrText xml:space="preserve"> REF GSE215968-wilcox-test-of-FXYD7-in-Cells \h</w:instrText>
+      </w:r>
+      <w:r>
+        <w:fldChar w:fldCharType="separate"/>
+      </w:r>
+      <w:r>
+        <w:rPr>
+          <w:b/>
+          <w:strike w:val="0"/>
+        </w:rPr>
+        <w:t>11</w:t>
+      </w:r>
+      <w:r>
+        <w:fldChar w:fldCharType="end"/>
+      </w:r>
+      <w:r>
+        <w:fldChar w:fldCharType="end"/>
+      </w:r>
+      <w:r>
+        <w:t xml:space="preserve"> ) </w:t>
+      </w:r>
+    </w:p>
+    <w:p>
+      <w:pPr>
+        <w:rPr>
+          <w:rFonts w:hint="eastAsia"/>
+        </w:rPr>
+      </w:pPr>
+      <w:r>
+        <w:rPr>
+          <w:rFonts w:hint="eastAsia"/>
+        </w:rPr>
+        <w:t>分析结果不符合预期，且疾病较为特殊，单细胞数据集目前只找到分析中的这个数据集，以及另一个相同作者的数据集，</w:t>
+      </w:r>
+      <w:r>
+        <w:t xml:space="preserve"> </w:t>
+      </w:r>
+      <w:r>
+        <w:rPr>
+          <w:rFonts w:hint="eastAsia"/>
+        </w:rPr>
+        <w:t>(GSE216748，6个样本。)</w:t>
+      </w:r>
+      <w:r>
+        <w:t xml:space="preserve"> </w:t>
+      </w:r>
+      <w:r>
+        <w:rPr>
+          <w:rFonts w:hint="eastAsia"/>
+        </w:rPr>
+        <w:t>是否需要先尝试改换该单细胞数据集来筛选关键细胞？</w:t>
+      </w:r>
+    </w:p>
+    <w:p>
+      <w:pPr>
+        <w:numPr>
+          <w:ilvl w:val="0"/>
+          <w:numId w:val="2"/>
+        </w:numPr>
+        <w:ind w:left="1134" w:leftChars="0" w:hanging="567" w:firstLineChars="0"/>
+        <w:rPr>
+          <w:rFonts w:hint="eastAsia"/>
+        </w:rPr>
+      </w:pPr>
+      <w:r>
+        <w:rPr>
+          <w:rFonts w:hint="default"/>
+          <w:lang w:val="en-US"/>
+        </w:rPr>
+        <w:t>asdf</w:t>
       </w:r>
       <w:bookmarkStart w:id="14" w:name="_GoBack"/>
       <w:bookmarkEnd w:id="14"/>
-      <w:r>
-        <w:rPr>
-          <w:rFonts w:hint="eastAsia"/>
-        </w:rPr>
-        <w:t>测价值。(</w:t>
-      </w:r>
-      <w:r>
-        <w:t xml:space="preserve"> Fig. </w:t>
-      </w:r>
-      <w:r>
-        <w:fldChar w:fldCharType="begin"/>
-      </w:r>
-      <w:r>
-        <w:instrText xml:space="preserve"> HYPERLINK \l "IUA-ROC-evaluation-of-diagnostic-indicators" \h </w:instrText>
-      </w:r>
-      <w:r>
-        <w:fldChar w:fldCharType="separate"/>
-      </w:r>
-      <w:r>
-        <w:fldChar w:fldCharType="begin"/>
-      </w:r>
-      <w:r>
-        <w:instrText xml:space="preserve"> REF IUA-ROC-evaluation-of-diagnostic-indicators \h</w:instrText>
-      </w:r>
-      <w:r>
-        <w:fldChar w:fldCharType="separate"/>
-      </w:r>
-      <w:r>
-        <w:rPr>
-          <w:b/>
-          <w:strike w:val="0"/>
-        </w:rPr>
-        <w:t>4</w:t>
-      </w:r>
-      <w:r>
-        <w:fldChar w:fldCharType="end"/>
-      </w:r>
-      <w:r>
-        <w:fldChar w:fldCharType="end"/>
-      </w:r>
-      <w:r>
-        <w:t xml:space="preserve"> )</w:t>
-      </w:r>
-    </w:p>
-    <w:p>
-      <w:r>
-        <w:rPr>
-          <w:rFonts w:hint="eastAsia"/>
-        </w:rPr>
-        <w:t>到单细胞分析环节，细胞注释等也无问题。见</w:t>
-      </w:r>
-      <w:r>
-        <w:t xml:space="preserve"> Fig. </w:t>
-      </w:r>
-      <w:r>
-        <w:fldChar w:fldCharType="begin"/>
-      </w:r>
-      <w:r>
-        <w:instrText xml:space="preserve"> HYPERLINK \l "GSE215968-SCSA-Cell-type-annotation" \h </w:instrText>
-      </w:r>
-      <w:r>
-        <w:fldChar w:fldCharType="separate"/>
-      </w:r>
-      <w:r>
-        <w:fldChar w:fldCharType="begin"/>
-      </w:r>
-      <w:r>
-        <w:instrText xml:space="preserve"> REF GSE215968-SCSA-Cell-type-annotation \h</w:instrText>
-      </w:r>
-      <w:r>
-        <w:fldChar w:fldCharType="separate"/>
-      </w:r>
-      <w:r>
-        <w:rPr>
-          <w:b/>
-          <w:strike w:val="0"/>
-        </w:rPr>
-        <w:t>5</w:t>
-      </w:r>
-      <w:r>
-        <w:fldChar w:fldCharType="end"/>
-      </w:r>
-      <w:r>
-        <w:fldChar w:fldCharType="end"/>
+    </w:p>
+    <w:p>
+      <w:pPr>
+        <w:numPr>
+          <w:ilvl w:val="0"/>
+          <w:numId w:val="2"/>
+        </w:numPr>
+        <w:ind w:left="1134" w:leftChars="0" w:hanging="567" w:firstLineChars="0"/>
+        <w:rPr>
+          <w:rFonts w:hint="eastAsia"/>
+        </w:rPr>
+      </w:pPr>
+      <w:r>
+        <w:rPr>
+          <w:rFonts w:hint="default"/>
+          <w:lang w:val="en-US"/>
+        </w:rPr>
+        <w:t>asdf</w:t>
+      </w:r>
+    </w:p>
+    <w:p>
+      <w:pPr>
+        <w:bidi w:val="0"/>
+        <w:rPr>
+          <w:rFonts w:hint="default"/>
+          <w:lang w:val="en-US"/>
+        </w:rPr>
+      </w:pPr>
+      <w:r>
+        <w:rPr>
+          <w:rFonts w:hint="eastAsia"/>
+        </w:rPr>
+        <w:t>分析结果不符合预期，且疾病较为特殊，单细胞数据集目前只找到分析中的这个数据集，以及另一个相同作者的数据集，</w:t>
       </w:r>
       <w:r>
         <w:t xml:space="preserve"> </w:t>
@@ -469,97 +917,7 @@
         <w:rPr>
           <w:rFonts w:hint="eastAsia"/>
         </w:rPr>
-        <w:t>，</w:t>
-      </w:r>
-      <w:r>
-        <w:t xml:space="preserve"> Fig. </w:t>
-      </w:r>
-      <w:r>
-        <w:fldChar w:fldCharType="begin"/>
-      </w:r>
-      <w:r>
-        <w:instrText xml:space="preserve"> HYPERLINK \l "GSE215968-Marker-Validation" \h </w:instrText>
-      </w:r>
-      <w:r>
-        <w:fldChar w:fldCharType="separate"/>
-      </w:r>
-      <w:r>
-        <w:fldChar w:fldCharType="begin"/>
-      </w:r>
-      <w:r>
-        <w:instrText xml:space="preserve"> REF GSE215968-Marker-Validation \h</w:instrText>
-      </w:r>
-      <w:r>
-        <w:fldChar w:fldCharType="separate"/>
-      </w:r>
-      <w:r>
-        <w:rPr>
-          <w:b/>
-          <w:strike w:val="0"/>
-        </w:rPr>
-        <w:t>6</w:t>
-      </w:r>
-      <w:r>
-        <w:fldChar w:fldCharType="end"/>
-      </w:r>
-      <w:r>
-        <w:fldChar w:fldCharType="end"/>
-      </w:r>
-    </w:p>
-    <w:bookmarkEnd w:id="0"/>
-    <w:p>
-      <w:pPr>
-        <w:pStyle w:val="4"/>
-        <w:bidi w:val="0"/>
-      </w:pPr>
-      <w:bookmarkStart w:id="1" w:name="问题"/>
-      <w:r>
-        <w:rPr>
-          <w:rFonts w:hint="eastAsia"/>
-        </w:rPr>
-        <w:t>问题</w:t>
-      </w:r>
-    </w:p>
-    <w:p>
-      <w:r>
-        <w:rPr>
-          <w:rFonts w:hint="eastAsia"/>
-        </w:rPr>
-        <w:t>到了筛选关键细胞环节，</w:t>
-      </w:r>
-      <w:r>
-        <w:t xml:space="preserve"> Fig. </w:t>
-      </w:r>
-      <w:r>
-        <w:fldChar w:fldCharType="begin"/>
-      </w:r>
-      <w:r>
-        <w:instrText xml:space="preserve"> HYPERLINK \l "GSE215968-SCSA-annotation-Cell-Proportions-in-each-sample" \h </w:instrText>
-      </w:r>
-      <w:r>
-        <w:fldChar w:fldCharType="separate"/>
-      </w:r>
-      <w:r>
-        <w:fldChar w:fldCharType="begin"/>
-      </w:r>
-      <w:r>
-        <w:instrText xml:space="preserve"> REF GSE215968-SCSA-annotation-Cell-Proportions-in-each-sample \h</w:instrText>
-      </w:r>
-      <w:r>
-        <w:fldChar w:fldCharType="separate"/>
-      </w:r>
-      <w:r>
-        <w:rPr>
-          <w:b/>
-          <w:strike w:val="0"/>
-        </w:rPr>
-        <w:t>7</w:t>
-      </w:r>
-      <w:r>
-        <w:fldChar w:fldCharType="end"/>
-      </w:r>
-      <w:r>
-        <w:fldChar w:fldCharType="end"/>
+        <w:t>(GSE216748，6个样本。)</w:t>
       </w:r>
       <w:r>
         <w:t xml:space="preserve"> </w:t>
@@ -568,276 +926,7 @@
         <w:rPr>
           <w:rFonts w:hint="eastAsia"/>
         </w:rPr>
-        <w:t>，</w:t>
-      </w:r>
-      <w:r>
-        <w:t xml:space="preserve"> </w:t>
-      </w:r>
-      <w:r>
-        <w:rPr>
-          <w:rFonts w:hint="eastAsia"/>
-        </w:rPr>
-        <w:t>有显著差异的细胞</w:t>
-      </w:r>
-      <w:r>
-        <w:t xml:space="preserve"> (Fig. </w:t>
-      </w:r>
-      <w:r>
-        <w:fldChar w:fldCharType="begin"/>
-      </w:r>
-      <w:r>
-        <w:instrText xml:space="preserve"> HYPERLINK \l "GSE215968-Cell-Proportion-intergroup-comparison" \h </w:instrText>
-      </w:r>
-      <w:r>
-        <w:fldChar w:fldCharType="separate"/>
-      </w:r>
-      <w:r>
-        <w:fldChar w:fldCharType="begin"/>
-      </w:r>
-      <w:r>
-        <w:instrText xml:space="preserve"> REF GSE215968-Cell-Proportion-intergroup-comparison \h</w:instrText>
-      </w:r>
-      <w:r>
-        <w:fldChar w:fldCharType="separate"/>
-      </w:r>
-      <w:r>
-        <w:rPr>
-          <w:b/>
-          <w:strike w:val="0"/>
-        </w:rPr>
-        <w:t>8</w:t>
-      </w:r>
-      <w:r>
-        <w:fldChar w:fldCharType="end"/>
-      </w:r>
-      <w:r>
-        <w:fldChar w:fldCharType="end"/>
-      </w:r>
-      <w:r>
-        <w:t xml:space="preserve"> ) </w:t>
-      </w:r>
-      <w:r>
-        <w:rPr>
-          <w:rFonts w:hint="eastAsia"/>
-        </w:rPr>
-        <w:t>为</w:t>
-      </w:r>
-      <w:r>
-        <w:t xml:space="preserve"> Cytotoxic NK </w:t>
-      </w:r>
-      <w:r>
-        <w:rPr>
-          <w:rFonts w:hint="eastAsia"/>
-        </w:rPr>
-        <w:t>和</w:t>
-      </w:r>
-      <w:r>
-        <w:t xml:space="preserve"> CD8+ T </w:t>
-      </w:r>
-      <w:r>
-        <w:rPr>
-          <w:rFonts w:hint="eastAsia"/>
-        </w:rPr>
-        <w:t>细胞。</w:t>
-      </w:r>
-      <w:r>
-        <w:t xml:space="preserve"> </w:t>
-      </w:r>
-      <w:r>
-        <w:rPr>
-          <w:rFonts w:hint="eastAsia"/>
-        </w:rPr>
-        <w:t>但两类细胞的两个生物标识物在组间不存在显著差异。</w:t>
-      </w:r>
-    </w:p>
-    <w:p>
-      <w:r>
-        <w:rPr>
-          <w:rFonts w:hint="eastAsia"/>
-        </w:rPr>
-        <w:t>基因</w:t>
-      </w:r>
-      <w:r>
-        <w:t xml:space="preserve"> H1-4 (HIST1H1E) </w:t>
-      </w:r>
-      <w:r>
-        <w:rPr>
-          <w:rFonts w:hint="eastAsia"/>
-        </w:rPr>
-        <w:t>在</w:t>
-      </w:r>
-      <w:r>
-        <w:t xml:space="preserve"> AS Epithelium </w:t>
-      </w:r>
-      <w:r>
-        <w:rPr>
-          <w:rFonts w:hint="eastAsia"/>
-        </w:rPr>
-        <w:t>和</w:t>
-      </w:r>
-      <w:r>
-        <w:t xml:space="preserve"> B </w:t>
-      </w:r>
-      <w:r>
-        <w:rPr>
-          <w:rFonts w:hint="eastAsia"/>
-        </w:rPr>
-        <w:t>细胞中有显著差异</w:t>
-      </w:r>
-      <w:r>
-        <w:t xml:space="preserve"> ( Fig. </w:t>
-      </w:r>
-      <w:r>
-        <w:fldChar w:fldCharType="begin"/>
-      </w:r>
-      <w:r>
-        <w:instrText xml:space="preserve"> HYPERLINK \l "GSE215968-wilcox-test-of-HIST1H1E-in-Cells" \h </w:instrText>
-      </w:r>
-      <w:r>
-        <w:fldChar w:fldCharType="separate"/>
-      </w:r>
-      <w:r>
-        <w:fldChar w:fldCharType="begin"/>
-      </w:r>
-      <w:r>
-        <w:instrText xml:space="preserve"> REF GSE215968-wilcox-test-of-HIST1H1E-in-Cells \h</w:instrText>
-      </w:r>
-      <w:r>
-        <w:fldChar w:fldCharType="separate"/>
-      </w:r>
-      <w:r>
-        <w:rPr>
-          <w:b/>
-          <w:strike w:val="0"/>
-        </w:rPr>
-        <w:t>10</w:t>
-      </w:r>
-      <w:r>
-        <w:fldChar w:fldCharType="end"/>
-      </w:r>
-      <w:r>
-        <w:fldChar w:fldCharType="end"/>
-      </w:r>
-      <w:r>
-        <w:t xml:space="preserve"> ) 。</w:t>
-      </w:r>
-    </w:p>
-    <w:p>
-      <w:r>
-        <w:rPr>
-          <w:rFonts w:hint="eastAsia"/>
-        </w:rPr>
-        <w:t>拟以</w:t>
-      </w:r>
-      <w:r>
-        <w:t xml:space="preserve"> B </w:t>
-      </w:r>
-      <w:r>
-        <w:rPr>
-          <w:rFonts w:hint="eastAsia"/>
-        </w:rPr>
-        <w:t>细胞为关键细胞，但效果较差，不符和方案预期。</w:t>
-      </w:r>
-      <w:r>
-        <w:t xml:space="preserve"> </w:t>
-      </w:r>
-      <w:r>
-        <w:rPr>
-          <w:rFonts w:hint="eastAsia"/>
-        </w:rPr>
-        <w:t>预期为：“子宫内膜上皮细胞、子宫内膜基质成纤维细胞、M2</w:t>
-      </w:r>
-      <w:r>
-        <w:t xml:space="preserve"> </w:t>
-      </w:r>
-      <w:r>
-        <w:rPr>
-          <w:rFonts w:hint="eastAsia"/>
-        </w:rPr>
-        <w:t>型巨噬细胞、活化型</w:t>
-      </w:r>
-      <w:r>
-        <w:t xml:space="preserve"> CD4+ T </w:t>
-      </w:r>
-      <w:r>
-        <w:rPr>
-          <w:rFonts w:hint="eastAsia"/>
-        </w:rPr>
-        <w:t>细胞、血管内皮细胞”</w:t>
-      </w:r>
-    </w:p>
-    <w:p>
-      <w:r>
-        <w:t xml:space="preserve">(FXYD7 </w:t>
-      </w:r>
-      <w:r>
-        <w:rPr>
-          <w:rFonts w:hint="eastAsia"/>
-        </w:rPr>
-        <w:t>在各细胞中的情况为</w:t>
-      </w:r>
-      <w:r>
-        <w:t xml:space="preserve"> Fig. </w:t>
-      </w:r>
-      <w:r>
-        <w:fldChar w:fldCharType="begin"/>
-      </w:r>
-      <w:r>
-        <w:instrText xml:space="preserve"> HYPERLINK \l "GSE215968-wilcox-test-of-FXYD7-in-Cells" \h </w:instrText>
-      </w:r>
-      <w:r>
-        <w:fldChar w:fldCharType="separate"/>
-      </w:r>
-      <w:r>
-        <w:fldChar w:fldCharType="begin"/>
-      </w:r>
-      <w:r>
-        <w:instrText xml:space="preserve"> REF GSE215968-wilcox-test-of-FXYD7-in-Cells \h</w:instrText>
-      </w:r>
-      <w:r>
-        <w:fldChar w:fldCharType="separate"/>
-      </w:r>
-      <w:r>
-        <w:rPr>
-          <w:b/>
-          <w:strike w:val="0"/>
-        </w:rPr>
-        <w:t>11</w:t>
-      </w:r>
-      <w:r>
-        <w:fldChar w:fldCharType="end"/>
-      </w:r>
-      <w:r>
-        <w:fldChar w:fldCharType="end"/>
-      </w:r>
-      <w:r>
-        <w:t xml:space="preserve"> ) </w:t>
-      </w:r>
-    </w:p>
-    <w:p>
-      <w:r>
-        <w:rPr>
-          <w:rFonts w:hint="eastAsia"/>
-        </w:rPr>
-        <w:t>分析结果不符合预期，且疾病较为特殊，单细胞数据集目前只找到分析中的这个数据集，以及另一个相同作者的数据集，</w:t>
-      </w:r>
-      <w:r>
-        <w:t xml:space="preserve"> </w:t>
-      </w:r>
-      <w:r>
-        <w:rPr>
-          <w:rFonts w:hint="eastAsia"/>
-        </w:rPr>
-        <w:t>(GSE216748，6个样本。)</w:t>
-      </w:r>
-      <w:r>
-        <w:t xml:space="preserve"> </w:t>
-      </w:r>
-      <w:r>
-        <w:rPr>
-          <w:rFonts w:hint="eastAsia"/>
-        </w:rPr>
-        <w:t>是否需要先尝试改换该单细胞数据集来筛选关键细胞？</w:t>
+        <w:t>是否需要先尝试改换该单细胞数据集来筛选关键细胞</w:t>
       </w:r>
     </w:p>
     <w:p>
@@ -860,7 +949,7 @@
                     </pic:cNvPicPr>
                   </pic:nvPicPr>
                   <pic:blipFill>
-                    <a:blip r:embed="rId7"/>
+                    <a:blip r:embed="rId8"/>
                     <a:stretch>
                       <a:fillRect/>
                     </a:stretch>
@@ -969,7 +1058,7 @@
       <w:pPr>
         <w:numPr>
           <w:ilvl w:val="0"/>
-          <w:numId w:val="2"/>
+          <w:numId w:val="3"/>
         </w:numPr>
       </w:pPr>
       <w:r>
@@ -1070,7 +1159,7 @@
                     </pic:cNvPicPr>
                   </pic:nvPicPr>
                   <pic:blipFill>
-                    <a:blip r:embed="rId8"/>
+                    <a:blip r:embed="rId9"/>
                     <a:stretch>
                       <a:fillRect/>
                     </a:stretch>
@@ -1175,7 +1264,7 @@
       <w:pPr>
         <w:numPr>
           <w:ilvl w:val="0"/>
-          <w:numId w:val="2"/>
+          <w:numId w:val="3"/>
         </w:numPr>
       </w:pPr>
       <w:r>
@@ -1276,7 +1365,7 @@
                     </pic:cNvPicPr>
                   </pic:nvPicPr>
                   <pic:blipFill>
-                    <a:blip r:embed="rId9"/>
+                    <a:blip r:embed="rId10"/>
                     <a:stretch>
                       <a:fillRect/>
                     </a:stretch>
@@ -1460,7 +1549,7 @@
                     </pic:cNvPicPr>
                   </pic:nvPicPr>
                   <pic:blipFill>
-                    <a:blip r:embed="rId10"/>
+                    <a:blip r:embed="rId11"/>
                     <a:stretch>
                       <a:fillRect/>
                     </a:stretch>
@@ -1626,7 +1715,7 @@
                     </pic:cNvPicPr>
                   </pic:nvPicPr>
                   <pic:blipFill>
-                    <a:blip r:embed="rId11"/>
+                    <a:blip r:embed="rId12"/>
                     <a:stretch>
                       <a:fillRect/>
                     </a:stretch>
@@ -1810,7 +1899,7 @@
                     </pic:cNvPicPr>
                   </pic:nvPicPr>
                   <pic:blipFill>
-                    <a:blip r:embed="rId12"/>
+                    <a:blip r:embed="rId13"/>
                     <a:stretch>
                       <a:fillRect/>
                     </a:stretch>
@@ -1985,7 +2074,7 @@
                     </pic:cNvPicPr>
                   </pic:nvPicPr>
                   <pic:blipFill>
-                    <a:blip r:embed="rId13"/>
+                    <a:blip r:embed="rId14"/>
                     <a:stretch>
                       <a:fillRect/>
                     </a:stretch>
@@ -2160,7 +2249,7 @@
                     </pic:cNvPicPr>
                   </pic:nvPicPr>
                   <pic:blipFill>
-                    <a:blip r:embed="rId14"/>
+                    <a:blip r:embed="rId15"/>
                     <a:stretch>
                       <a:fillRect/>
                     </a:stretch>
@@ -2326,7 +2415,7 @@
                     </pic:cNvPicPr>
                   </pic:nvPicPr>
                   <pic:blipFill>
-                    <a:blip r:embed="rId15"/>
+                    <a:blip r:embed="rId16"/>
                     <a:stretch>
                       <a:fillRect/>
                     </a:stretch>
@@ -2524,7 +2613,7 @@
                     </pic:cNvPicPr>
                   </pic:nvPicPr>
                   <pic:blipFill>
-                    <a:blip r:embed="rId16"/>
+                    <a:blip r:embed="rId17"/>
                     <a:stretch>
                       <a:fillRect/>
                     </a:stretch>
@@ -2690,7 +2779,7 @@
                     </pic:cNvPicPr>
                   </pic:nvPicPr>
                   <pic:blipFill>
-                    <a:blip r:embed="rId17"/>
+                    <a:blip r:embed="rId18"/>
                     <a:stretch>
                       <a:fillRect/>
                     </a:stretch>
@@ -2856,7 +2945,7 @@
                     </pic:cNvPicPr>
                   </pic:nvPicPr>
                   <pic:blipFill>
-                    <a:blip r:embed="rId18"/>
+                    <a:blip r:embed="rId19"/>
                     <a:stretch>
                       <a:fillRect/>
                     </a:stretch>
@@ -3033,7 +3122,7 @@
     </w:p>
     <w:bookmarkEnd w:id="1"/>
     <w:sectPr>
-      <w:headerReference r:id="rId5" w:type="default"/>
+      <w:footerReference r:id="rId6" w:type="default"/>
       <w:pgSz w:w="11906" w:h="16838"/>
       <w:pgMar w:top="1440" w:right="1800" w:bottom="1440" w:left="1800" w:header="851" w:footer="992" w:gutter="0"/>
       <w:pgBorders>
@@ -3042,7 +3131,7 @@
         <w:bottom w:val="none" w:sz="0" w:space="0"/>
         <w:right w:val="none" w:sz="0" w:space="0"/>
       </w:pgBorders>
-      <w:pgNumType w:start="1"/>
+      <w:pgNumType w:fmt="decimalFullWidth" w:start="1"/>
       <w:cols w:space="425" w:num="1"/>
       <w:docGrid w:type="lines" w:linePitch="312" w:charSpace="0"/>
     </w:sectPr>
@@ -3075,6 +3164,220 @@
     </w:p>
   </w:endnote>
 </w:endnotes>
+</file>
+
+<file path=word/footer1.xml><?xml version="1.0" encoding="utf-8"?>
+<w:ftr xmlns:wpc="http://schemas.microsoft.com/office/word/2010/wordprocessingCanvas" xmlns:mc="http://schemas.openxmlformats.org/markup-compatibility/2006" xmlns:o="urn:schemas-microsoft-com:office:office" xmlns:r="http://schemas.openxmlformats.org/officeDocument/2006/relationships" xmlns:m="http://schemas.openxmlformats.org/officeDocument/2006/math" xmlns:v="urn:schemas-microsoft-com:vml" xmlns:wp14="http://schemas.microsoft.com/office/word/2010/wordprocessingDrawing" xmlns:wp="http://schemas.openxmlformats.org/drawingml/2006/wordprocessingDrawing" xmlns:w10="urn:schemas-microsoft-com:office:word" xmlns:w="http://schemas.openxmlformats.org/wordprocessingml/2006/main" xmlns:w14="http://schemas.microsoft.com/office/word/2010/wordml" xmlns:w15="http://schemas.microsoft.com/office/word/2012/wordml" xmlns:wpg="http://schemas.microsoft.com/office/word/2010/wordprocessingGroup" xmlns:wpi="http://schemas.microsoft.com/office/word/2010/wordprocessingInk" xmlns:wne="http://schemas.microsoft.com/office/word/2006/wordml" xmlns:wps="http://schemas.microsoft.com/office/word/2010/wordprocessingShape" xmlns:wpsCustomData="http://www.wps.cn/officeDocument/2013/wpsCustomData" mc:Ignorable="w14 w15 wp14">
+  <w:p>
+    <w:pPr>
+      <w:pStyle w:val="11"/>
+    </w:pPr>
+    <w:r>
+      <w:rPr>
+        <w:sz w:val="18"/>
+      </w:rPr>
+      <mc:AlternateContent>
+        <mc:Choice Requires="wps">
+          <w:drawing>
+            <wp:anchor distT="0" distB="0" distL="114300" distR="114300" simplePos="0" relativeHeight="251659264" behindDoc="0" locked="0" layoutInCell="1" allowOverlap="1">
+              <wp:simplePos x="0" y="0"/>
+              <wp:positionH relativeFrom="margin">
+                <wp:align>center</wp:align>
+              </wp:positionH>
+              <wp:positionV relativeFrom="paragraph">
+                <wp:posOffset>0</wp:posOffset>
+              </wp:positionV>
+              <wp:extent cx="1828800" cy="1828800"/>
+              <wp:effectExtent l="0" t="0" r="0" b="0"/>
+              <wp:wrapNone/>
+              <wp:docPr id="4" name="文本框 4"/>
+              <wp:cNvGraphicFramePr/>
+              <a:graphic xmlns:a="http://schemas.openxmlformats.org/drawingml/2006/main">
+                <a:graphicData uri="http://schemas.microsoft.com/office/word/2010/wordprocessingShape">
+                  <wps:wsp>
+                    <wps:cNvSpPr txBox="1"/>
+                    <wps:spPr>
+                      <a:xfrm>
+                        <a:off x="0" y="0"/>
+                        <a:ext cx="1828800" cy="1828800"/>
+                      </a:xfrm>
+                      <a:prstGeom prst="rect">
+                        <a:avLst/>
+                      </a:prstGeom>
+                      <a:noFill/>
+                      <a:ln w="6350">
+                        <a:noFill/>
+                      </a:ln>
+                    </wps:spPr>
+                    <wps:style>
+                      <a:lnRef idx="0">
+                        <a:schemeClr val="accent1"/>
+                      </a:lnRef>
+                      <a:fillRef idx="0">
+                        <a:schemeClr val="accent1"/>
+                      </a:fillRef>
+                      <a:effectRef idx="0">
+                        <a:schemeClr val="accent1"/>
+                      </a:effectRef>
+                      <a:fontRef idx="minor">
+                        <a:schemeClr val="dk1"/>
+                      </a:fontRef>
+                    </wps:style>
+                    <wps:txbx>
+                      <w:txbxContent>
+                        <w:p>
+                          <w:pPr>
+                            <w:pStyle w:val="11"/>
+                            <w:rPr>
+                              <w:rFonts w:hint="default" w:ascii="Times New Roman" w:hAnsi="Times New Roman" w:eastAsia="宋体" w:cs="Times New Roman"/>
+                              <w:b w:val="0"/>
+                              <w:bCs w:val="0"/>
+                              <w:sz w:val="18"/>
+                              <w:szCs w:val="18"/>
+                            </w:rPr>
+                          </w:pPr>
+                          <w:r>
+                            <w:rPr>
+                              <w:rFonts w:hint="default" w:ascii="Times New Roman" w:hAnsi="Times New Roman" w:eastAsia="宋体" w:cs="Times New Roman"/>
+                              <w:b w:val="0"/>
+                              <w:bCs w:val="0"/>
+                              <w:sz w:val="18"/>
+                              <w:szCs w:val="18"/>
+                            </w:rPr>
+                            <w:fldChar w:fldCharType="begin"/>
+                          </w:r>
+                          <w:r>
+                            <w:rPr>
+                              <w:rFonts w:hint="default" w:ascii="Times New Roman" w:hAnsi="Times New Roman" w:eastAsia="宋体" w:cs="Times New Roman"/>
+                              <w:b w:val="0"/>
+                              <w:bCs w:val="0"/>
+                              <w:sz w:val="18"/>
+                              <w:szCs w:val="18"/>
+                            </w:rPr>
+                            <w:instrText xml:space="preserve"> PAGE  \* MERGEFORMAT </w:instrText>
+                          </w:r>
+                          <w:r>
+                            <w:rPr>
+                              <w:rFonts w:hint="default" w:ascii="Times New Roman" w:hAnsi="Times New Roman" w:eastAsia="宋体" w:cs="Times New Roman"/>
+                              <w:b w:val="0"/>
+                              <w:bCs w:val="0"/>
+                              <w:sz w:val="18"/>
+                              <w:szCs w:val="18"/>
+                            </w:rPr>
+                            <w:fldChar w:fldCharType="separate"/>
+                          </w:r>
+                          <w:r>
+                            <w:rPr>
+                              <w:rFonts w:hint="default" w:ascii="Times New Roman" w:hAnsi="Times New Roman" w:eastAsia="宋体" w:cs="Times New Roman"/>
+                              <w:b w:val="0"/>
+                              <w:bCs w:val="0"/>
+                              <w:sz w:val="18"/>
+                              <w:szCs w:val="18"/>
+                            </w:rPr>
+                            <w:t>1</w:t>
+                          </w:r>
+                          <w:r>
+                            <w:rPr>
+                              <w:rFonts w:hint="default" w:ascii="Times New Roman" w:hAnsi="Times New Roman" w:eastAsia="宋体" w:cs="Times New Roman"/>
+                              <w:b w:val="0"/>
+                              <w:bCs w:val="0"/>
+                              <w:sz w:val="18"/>
+                              <w:szCs w:val="18"/>
+                            </w:rPr>
+                            <w:fldChar w:fldCharType="end"/>
+                          </w:r>
+                        </w:p>
+                      </w:txbxContent>
+                    </wps:txbx>
+                    <wps:bodyPr rot="0" spcFirstLastPara="0" vertOverflow="overflow" horzOverflow="overflow" vert="horz" wrap="none" lIns="0" tIns="0" rIns="0" bIns="0" numCol="1" spcCol="0" rtlCol="0" fromWordArt="0" anchor="t" anchorCtr="0" forceAA="0" upright="0" compatLnSpc="1">
+                      <a:spAutoFit/>
+                    </wps:bodyPr>
+                  </wps:wsp>
+                </a:graphicData>
+              </a:graphic>
+            </wp:anchor>
+          </w:drawing>
+        </mc:Choice>
+        <mc:Fallback>
+          <w:pict>
+            <v:shape id="_x0000_s1026" o:spid="_x0000_s1026" o:spt="202" type="#_x0000_t202" style="position:absolute;left:0pt;margin-top:0pt;height:144pt;width:144pt;mso-position-horizontal:center;mso-position-horizontal-relative:margin;mso-wrap-style:none;z-index:251659264;mso-width-relative:page;mso-height-relative:page;" filled="f" stroked="f" coordsize="21600,21600" o:gfxdata="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">
+              <v:fill on="f" focussize="0,0"/>
+              <v:stroke on="f" weight="0.5pt"/>
+              <v:imagedata o:title=""/>
+              <o:lock v:ext="edit" aspectratio="f"/>
+              <v:textbox inset="0mm,0mm,0mm,0mm" style="mso-fit-shape-to-text:t;">
+                <w:txbxContent>
+                  <w:p>
+                    <w:pPr>
+                      <w:pStyle w:val="11"/>
+                      <w:rPr>
+                        <w:rFonts w:hint="default" w:ascii="Times New Roman" w:hAnsi="Times New Roman" w:eastAsia="宋体" w:cs="Times New Roman"/>
+                        <w:b w:val="0"/>
+                        <w:bCs w:val="0"/>
+                        <w:sz w:val="18"/>
+                        <w:szCs w:val="18"/>
+                      </w:rPr>
+                    </w:pPr>
+                    <w:r>
+                      <w:rPr>
+                        <w:rFonts w:hint="default" w:ascii="Times New Roman" w:hAnsi="Times New Roman" w:eastAsia="宋体" w:cs="Times New Roman"/>
+                        <w:b w:val="0"/>
+                        <w:bCs w:val="0"/>
+                        <w:sz w:val="18"/>
+                        <w:szCs w:val="18"/>
+                      </w:rPr>
+                      <w:fldChar w:fldCharType="begin"/>
+                    </w:r>
+                    <w:r>
+                      <w:rPr>
+                        <w:rFonts w:hint="default" w:ascii="Times New Roman" w:hAnsi="Times New Roman" w:eastAsia="宋体" w:cs="Times New Roman"/>
+                        <w:b w:val="0"/>
+                        <w:bCs w:val="0"/>
+                        <w:sz w:val="18"/>
+                        <w:szCs w:val="18"/>
+                      </w:rPr>
+                      <w:instrText xml:space="preserve"> PAGE  \* MERGEFORMAT </w:instrText>
+                    </w:r>
+                    <w:r>
+                      <w:rPr>
+                        <w:rFonts w:hint="default" w:ascii="Times New Roman" w:hAnsi="Times New Roman" w:eastAsia="宋体" w:cs="Times New Roman"/>
+                        <w:b w:val="0"/>
+                        <w:bCs w:val="0"/>
+                        <w:sz w:val="18"/>
+                        <w:szCs w:val="18"/>
+                      </w:rPr>
+                      <w:fldChar w:fldCharType="separate"/>
+                    </w:r>
+                    <w:r>
+                      <w:rPr>
+                        <w:rFonts w:hint="default" w:ascii="Times New Roman" w:hAnsi="Times New Roman" w:eastAsia="宋体" w:cs="Times New Roman"/>
+                        <w:b w:val="0"/>
+                        <w:bCs w:val="0"/>
+                        <w:sz w:val="18"/>
+                        <w:szCs w:val="18"/>
+                      </w:rPr>
+                      <w:t>1</w:t>
+                    </w:r>
+                    <w:r>
+                      <w:rPr>
+                        <w:rFonts w:hint="default" w:ascii="Times New Roman" w:hAnsi="Times New Roman" w:eastAsia="宋体" w:cs="Times New Roman"/>
+                        <w:b w:val="0"/>
+                        <w:bCs w:val="0"/>
+                        <w:sz w:val="18"/>
+                        <w:szCs w:val="18"/>
+                      </w:rPr>
+                      <w:fldChar w:fldCharType="end"/>
+                    </w:r>
+                  </w:p>
+                </w:txbxContent>
+              </v:textbox>
+            </v:shape>
+          </w:pict>
+        </mc:Fallback>
+      </mc:AlternateContent>
+    </w:r>
+  </w:p>
+</w:ftr>
 </file>
 
 <file path=word/footnotes.xml><?xml version="1.0" encoding="utf-8"?>
@@ -3368,10 +3671,33 @@
       </w:rPr>
     </w:lvl>
   </w:abstractNum>
+  <w:abstractNum w:abstractNumId="2">
+    <w:nsid w:val="77BED6F3"/>
+    <w:multiLevelType w:val="singleLevel"/>
+    <w:tmpl w:val="77BED6F3"/>
+    <w:lvl w:ilvl="0" w:tentative="0">
+      <w:start w:val="1"/>
+      <w:numFmt w:val="bullet"/>
+      <w:lvlText w:val=""/>
+      <w:lvlJc w:val="left"/>
+      <w:pPr>
+        <w:tabs>
+          <w:tab w:val="left" w:pos="420"/>
+        </w:tabs>
+        <w:ind w:left="1134" w:leftChars="0" w:hanging="567" w:firstLineChars="0"/>
+      </w:pPr>
+      <w:rPr>
+        <w:rFonts w:hint="default" w:ascii="Wingdings" w:hAnsi="Wingdings" w:cs="Wingdings"/>
+      </w:rPr>
+    </w:lvl>
+  </w:abstractNum>
   <w:num w:numId="1">
     <w:abstractNumId w:val="0"/>
   </w:num>
   <w:num w:numId="2">
+    <w:abstractNumId w:val="2"/>
+  </w:num>
+  <w:num w:numId="3">
     <w:abstractNumId w:val="1"/>
   </w:num>
 </w:numbering>
@@ -4601,6 +4927,7 @@
   </w:style>
   <w:style w:type="character" w:customStyle="1" w:styleId="65">
     <w:name w:val="SpecialCharTok"/>
+    <w:qFormat/>
     <w:uiPriority w:val="0"/>
     <w:rPr>
       <w:b/>
@@ -4610,6 +4937,7 @@
   </w:style>
   <w:style w:type="character" w:customStyle="1" w:styleId="66">
     <w:name w:val="StringTok"/>
+    <w:qFormat/>
     <w:uiPriority w:val="0"/>
     <w:rPr>
       <w:color w:val="4E9A06"/>
@@ -4618,6 +4946,7 @@
   </w:style>
   <w:style w:type="character" w:customStyle="1" w:styleId="67">
     <w:name w:val="VerbatimStringTok"/>
+    <w:qFormat/>
     <w:uiPriority w:val="0"/>
     <w:rPr>
       <w:color w:val="4E9A06"/>
@@ -4626,6 +4955,7 @@
   </w:style>
   <w:style w:type="character" w:customStyle="1" w:styleId="68">
     <w:name w:val="SpecialStringTok"/>
+    <w:qFormat/>
     <w:uiPriority w:val="0"/>
     <w:rPr>
       <w:color w:val="4E9A06"/>
@@ -4634,6 +4964,7 @@
   </w:style>
   <w:style w:type="character" w:customStyle="1" w:styleId="69">
     <w:name w:val="ImportTok"/>
+    <w:qFormat/>
     <w:uiPriority w:val="0"/>
     <w:rPr>
       <w:shd w:val="clear" w:fill="F8F8F8"/>
@@ -4641,6 +4972,7 @@
   </w:style>
   <w:style w:type="character" w:customStyle="1" w:styleId="70">
     <w:name w:val="CommentTok"/>
+    <w:qFormat/>
     <w:uiPriority w:val="0"/>
     <w:rPr>
       <w:i/>
@@ -4650,6 +4982,7 @@
   </w:style>
   <w:style w:type="character" w:customStyle="1" w:styleId="71">
     <w:name w:val="DocumentationTok"/>
+    <w:qFormat/>
     <w:uiPriority w:val="0"/>
     <w:rPr>
       <w:b/>
@@ -4660,6 +4993,7 @@
   </w:style>
   <w:style w:type="character" w:customStyle="1" w:styleId="72">
     <w:name w:val="AnnotationTok"/>
+    <w:qFormat/>
     <w:uiPriority w:val="0"/>
     <w:rPr>
       <w:b/>
@@ -4670,6 +5004,7 @@
   </w:style>
   <w:style w:type="character" w:customStyle="1" w:styleId="73">
     <w:name w:val="CommentVarTok"/>
+    <w:qFormat/>
     <w:uiPriority w:val="0"/>
     <w:rPr>
       <w:b/>
@@ -4680,6 +5015,7 @@
   </w:style>
   <w:style w:type="character" w:customStyle="1" w:styleId="74">
     <w:name w:val="OtherTok"/>
+    <w:qFormat/>
     <w:uiPriority w:val="0"/>
     <w:rPr>
       <w:color w:val="8F5902"/>
@@ -4688,6 +5024,7 @@
   </w:style>
   <w:style w:type="character" w:customStyle="1" w:styleId="75">
     <w:name w:val="FunctionTok"/>
+    <w:qFormat/>
     <w:uiPriority w:val="0"/>
     <w:rPr>
       <w:b/>
@@ -4697,6 +5034,7 @@
   </w:style>
   <w:style w:type="character" w:customStyle="1" w:styleId="76">
     <w:name w:val="VariableTok"/>
+    <w:qFormat/>
     <w:uiPriority w:val="0"/>
     <w:rPr>
       <w:color w:val="000000"/>
@@ -4705,6 +5043,7 @@
   </w:style>
   <w:style w:type="character" w:customStyle="1" w:styleId="77">
     <w:name w:val="ControlFlowTok"/>
+    <w:qFormat/>
     <w:uiPriority w:val="0"/>
     <w:rPr>
       <w:b/>
@@ -4714,6 +5053,7 @@
   </w:style>
   <w:style w:type="character" w:customStyle="1" w:styleId="78">
     <w:name w:val="OperatorTok"/>
+    <w:qFormat/>
     <w:uiPriority w:val="0"/>
     <w:rPr>
       <w:b/>
@@ -4723,6 +5063,7 @@
   </w:style>
   <w:style w:type="character" w:customStyle="1" w:styleId="79">
     <w:name w:val="BuiltInTok"/>
+    <w:qFormat/>
     <w:uiPriority w:val="0"/>
     <w:rPr>
       <w:shd w:val="clear" w:fill="F8F8F8"/>
@@ -4730,6 +5071,7 @@
   </w:style>
   <w:style w:type="character" w:customStyle="1" w:styleId="80">
     <w:name w:val="ExtensionTok"/>
+    <w:qFormat/>
     <w:uiPriority w:val="0"/>
     <w:rPr>
       <w:shd w:val="clear" w:fill="F8F8F8"/>
@@ -4737,6 +5079,7 @@
   </w:style>
   <w:style w:type="character" w:customStyle="1" w:styleId="81">
     <w:name w:val="PreprocessorTok"/>
+    <w:qFormat/>
     <w:uiPriority w:val="0"/>
     <w:rPr>
       <w:i/>
@@ -4746,6 +5089,7 @@
   </w:style>
   <w:style w:type="character" w:customStyle="1" w:styleId="82">
     <w:name w:val="AttributeTok"/>
+    <w:qFormat/>
     <w:uiPriority w:val="0"/>
     <w:rPr>
       <w:color w:val="204A87"/>
@@ -4754,6 +5098,7 @@
   </w:style>
   <w:style w:type="character" w:customStyle="1" w:styleId="83">
     <w:name w:val="RegionMarkerTok"/>
+    <w:qFormat/>
     <w:uiPriority w:val="0"/>
     <w:rPr>
       <w:shd w:val="clear" w:fill="F8F8F8"/>
@@ -4761,6 +5106,7 @@
   </w:style>
   <w:style w:type="character" w:customStyle="1" w:styleId="84">
     <w:name w:val="InformationTok"/>
+    <w:qFormat/>
     <w:uiPriority w:val="0"/>
     <w:rPr>
       <w:b/>
@@ -4771,6 +5117,7 @@
   </w:style>
   <w:style w:type="character" w:customStyle="1" w:styleId="85">
     <w:name w:val="WarningTok"/>
+    <w:qFormat/>
     <w:uiPriority w:val="0"/>
     <w:rPr>
       <w:b/>
@@ -4781,6 +5128,7 @@
   </w:style>
   <w:style w:type="character" w:customStyle="1" w:styleId="86">
     <w:name w:val="AlertTok"/>
+    <w:qFormat/>
     <w:uiPriority w:val="0"/>
     <w:rPr>
       <w:color w:val="EF2929"/>
@@ -4789,6 +5137,7 @@
   </w:style>
   <w:style w:type="character" w:customStyle="1" w:styleId="87">
     <w:name w:val="ErrorTok"/>
+    <w:qFormat/>
     <w:uiPriority w:val="0"/>
     <w:rPr>
       <w:b/>
@@ -4798,6 +5147,7 @@
   </w:style>
   <w:style w:type="character" w:customStyle="1" w:styleId="88">
     <w:name w:val="NormalTok"/>
+    <w:qFormat/>
     <w:uiPriority w:val="0"/>
     <w:rPr>
       <w:shd w:val="clear" w:fill="F8F8F8"/>
@@ -5059,4 +5409,23 @@
   </a:themeElements>
   <a:objectDefaults/>
 </a:theme>
+</file>
+
+<file path=customXml/item1.xml><?xml version="1.0" encoding="utf-8"?>
+<s:customData xmlns="http://www.wps.cn/officeDocument/2013/wpsCustomData" xmlns:s="http://www.wps.cn/officeDocument/2013/wpsCustomData">
+  <customSectProps>
+    <customSectPr/>
+  </customSectProps>
+  <customShpExts>
+    <customShpInfo spid="_x0000_s1026" textRotate="1"/>
+  </customShpExts>
+</s:customData>
+</file>
+
+<file path=customXml/itemProps1.xml><?xml version="1.0" encoding="utf-8"?>
+<ds:datastoreItem xmlns:ds="http://schemas.openxmlformats.org/officeDocument/2006/customXml" ds:itemID="{B1977F7D-205B-4081-913C-38D41E755F92}">
+  <ds:schemaRefs>
+    <ds:schemaRef ds:uri="http://www.wps.cn/officeDocument/2013/wpsCustomData"/>
+  </ds:schemaRefs>
+</ds:datastoreItem>
 </file>
</xml_diff>

<commit_message>
Wed Apr  1 04:04:08 PM CST 2026
</commit_message>
<xml_diff>
--- a/inst/extdata/complex.docx
+++ b/inst/extdata/complex.docx
@@ -874,8 +874,6 @@
         </w:rPr>
         <w:t>asdf</w:t>
       </w:r>
-      <w:bookmarkStart w:id="14" w:name="_GoBack"/>
-      <w:bookmarkEnd w:id="14"/>
     </w:p>
     <w:p>
       <w:pPr>
@@ -1062,7 +1060,12 @@
         </w:numPr>
       </w:pPr>
       <w:r>
-        <w:t>All_intersection: TEX101, G6PC1, COMP, DLGAP1-AS3, ALOXE3P1, IDO2, OR7D2, MT1H, LINC01502, TM4SF1-AS1, MFSD4A, SERTM2, PAEP, IGKV3-20, ZPLD1, STAC2, CXCL13, IGHJ6, HABP2, TENM2, PEBP4, SORCS1, C4BPA, RBP4, KCNK13, LRRC26, PLA2G4E, XDH, NRAP, GPX3, CST2, CST1, PGM5P3-AS1, IGKJ4, DUOXA2, GGTLC5P, HAL, ADAMTS8, DUOX1, CLEC4E, IGHG1, ABCC8, GALNT13, TAS2R1, ANGPTL1, IGKC, IGKJ1, ADGRF4, TEX15, FBXL16, HLA-DOB, SDCBP2, SCGB2A1, NTRK1, LINC02535, EDNRB, CP, PRODH, ADAMTS15, ARLNC1, S100A3, SLC6A12, IMPDH1P5, FXYD7, …</w:t>
+        <w:t>All_intersection: TEX101, G6PC1, COMP, DLGAP1-AS3, ALOXE</w:t>
+      </w:r>
+      <w:bookmarkStart w:id="14" w:name="_GoBack"/>
+      <w:bookmarkEnd w:id="14"/>
+      <w:r>
+        <w:t>3P1, IDO2, OR7D2, MT1H, LINC01502, TM4SF1-AS1, MFSD4A, SERTM2, PAEP, IGKV3-20, ZPLD1, STAC2, CXCL13, IGHJ6, HABP2, TENM2, PEBP4, SORCS1, C4BPA, RBP4, KCNK13, LRRC26, PLA2G4E, XDH, NRAP, GPX3, CST2, CST1, PGM5P3-AS1, IGKJ4, DUOXA2, GGTLC5P, HAL, ADAMTS8, DUOX1, CLEC4E, IGHG1, ABCC8, GALNT13, TAS2R1, ANGPTL1, IGKC, IGKJ1, ADGRF4, TEX15, FBXL16, HLA-DOB, SDCBP2, SCGB2A1, NTRK1, LINC02535, EDNRB, CP, PRODH, ADAMTS15, ARLNC1, S100A3, SLC6A12, IMPDH1P5, FXYD7, …</w:t>
       </w:r>
     </w:p>
     <w:p>
@@ -5153,6 +5156,15 @@
       <w:shd w:val="clear" w:fill="F8F8F8"/>
     </w:rPr>
   </w:style>
+  <w:style w:type="character" w:customStyle="1" w:styleId="89">
+    <w:name w:val="red"/>
+    <w:basedOn w:val="20"/>
+    <w:uiPriority w:val="0"/>
+    <w:rPr>
+      <w:rFonts w:ascii="Times New Roman" w:hAnsi="Times New Roman"/>
+      <w:shd w:val="clear" w:fill="FF0000"/>
+    </w:rPr>
+  </w:style>
 </w:styles>
 </file>
 

</xml_diff>